<commit_message>
docs: PRO-SG-003 recalé sur le guide d'utilisation VISOR
Précisions tirées du guide V2.0.0.36 fourni par les services généraux :

- l'onglet Identifiants ne propose que les identifiants non attribués,
  un badge ne pouvant être associé qu'à un seul utilisateur
- statuts d'identifiant possibles : En service, Suspendu, Volé
- la liste des évènements affichée en bas d'écran ne couvre que la
  session VISOR en cours ; « Voir la liste » donne les 2 000 derniers
- un utilisateur peut cumuler jusqu'à dix groupes d'accès
- à la suppression, VISOR demande séparément si les identifiants
  rattachés doivent être supprimés : la réponse dépend du cas

Co-Authored-By: Claude Opus 5 <noreply@anthropic.com>
Claude-Session: https://claude.ai/code/session_015f3bXvDt4ZWz22riASrzWJ
</commit_message>
<xml_diff>
--- a/procedure-lyreco/PRO-SG-003_Gestion_des_acces_au_siege.docx
+++ b/procedure-lyreco/PRO-SG-003_Gestion_des_acces_au_siege.docx
@@ -691,7 +691,27 @@
           <w:sz w:val="18"/>
           <w:szCs w:val="18"/>
         </w:rPr>
-        <w:t xml:space="preserve">. Deux méthodes permettent d'associer un badge vierge.</w:t>
+        <w:t xml:space="preserve"> : seuls les identifiants </w:t>
+      </w:r>
+      <w:r>
+        <w:rPr>
+          <w:rFonts w:ascii="Cambria" w:cs="Cambria" w:eastAsia="Cambria" w:hAnsi="Cambria"/>
+          <w:b/>
+          <w:bCs/>
+          <w:color w:val="17232A"/>
+          <w:sz w:val="18"/>
+          <w:szCs w:val="18"/>
+        </w:rPr>
+        <w:t xml:space="preserve">non attribués</w:t>
+      </w:r>
+      <w:r>
+        <w:rPr>
+          <w:rFonts w:ascii="Cambria" w:cs="Cambria" w:eastAsia="Cambria" w:hAnsi="Cambria"/>
+          <w:color w:val="17232A"/>
+          <w:sz w:val="18"/>
+          <w:szCs w:val="18"/>
+        </w:rPr>
+        <w:t xml:space="preserve"> apparaissent, un badge ne pouvant être associé qu'à un seul utilisateur. Deux méthodes permettent d'associer un badge vierge.</w:t>
       </w:r>
     </w:p>
     <w:p>
@@ -841,7 +861,45 @@
           <w:sz w:val="18"/>
           <w:szCs w:val="18"/>
         </w:rPr>
-        <w:t xml:space="preserve"> avant de valider.</w:t>
+        <w:t xml:space="preserve"> — les autres valeurs possibles étant </w:t>
+      </w:r>
+      <w:r>
+        <w:rPr>
+          <w:rFonts w:ascii="Consolas" w:cs="Consolas" w:eastAsia="Consolas" w:hAnsi="Consolas"/>
+          <w:color w:val="0D5C63"/>
+          <w:sz w:val="16"/>
+          <w:szCs w:val="16"/>
+          <w:shd w:fill="EDF2F1" w:color="auto" w:val="clear"/>
+        </w:rPr>
+        <w:t xml:space="preserve">Suspendu</w:t>
+      </w:r>
+      <w:r>
+        <w:rPr>
+          <w:rFonts w:ascii="Cambria" w:cs="Cambria" w:eastAsia="Cambria" w:hAnsi="Cambria"/>
+          <w:color w:val="17232A"/>
+          <w:sz w:val="18"/>
+          <w:szCs w:val="18"/>
+        </w:rPr>
+        <w:t xml:space="preserve"> et </w:t>
+      </w:r>
+      <w:r>
+        <w:rPr>
+          <w:rFonts w:ascii="Consolas" w:cs="Consolas" w:eastAsia="Consolas" w:hAnsi="Consolas"/>
+          <w:color w:val="0D5C63"/>
+          <w:sz w:val="16"/>
+          <w:szCs w:val="16"/>
+          <w:shd w:fill="EDF2F1" w:color="auto" w:val="clear"/>
+        </w:rPr>
+        <w:t xml:space="preserve">Volé</w:t>
+      </w:r>
+      <w:r>
+        <w:rPr>
+          <w:rFonts w:ascii="Cambria" w:cs="Cambria" w:eastAsia="Cambria" w:hAnsi="Cambria"/>
+          <w:color w:val="17232A"/>
+          <w:sz w:val="18"/>
+          <w:szCs w:val="18"/>
+        </w:rPr>
+        <w:t xml:space="preserve"> — avant de valider.</w:t>
       </w:r>
     </w:p>
     <w:p>
@@ -896,7 +954,7 @@
           <w:sz w:val="18"/>
           <w:szCs w:val="18"/>
         </w:rPr>
-        <w:t xml:space="preserve">Dans VISOR, afficher la liste des événements récents en bas de l'écran, ou via </w:t>
+        <w:t xml:space="preserve">Dans VISOR, afficher la liste des évènements en bas de l'écran via </w:t>
       </w:r>
       <w:r>
         <w:rPr>
@@ -906,16 +964,54 @@
           <w:szCs w:val="16"/>
           <w:shd w:fill="EDF2F1" w:color="auto" w:val="clear"/>
         </w:rPr>
-        <w:t xml:space="preserve">Événements › Voir la liste</w:t>
-      </w:r>
-      <w:r>
-        <w:rPr>
-          <w:rFonts w:ascii="Cambria" w:cs="Cambria" w:eastAsia="Cambria" w:hAnsi="Cambria"/>
-          <w:color w:val="17232A"/>
-          <w:sz w:val="18"/>
-          <w:szCs w:val="18"/>
-        </w:rPr>
-        <w:t xml:space="preserve">.</w:t>
+        <w:t xml:space="preserve">Affichage › Liste des évènements</w:t>
+      </w:r>
+      <w:r>
+        <w:rPr>
+          <w:rFonts w:ascii="Cambria" w:cs="Cambria" w:eastAsia="Cambria" w:hAnsi="Cambria"/>
+          <w:color w:val="17232A"/>
+          <w:sz w:val="18"/>
+          <w:szCs w:val="18"/>
+        </w:rPr>
+        <w:t xml:space="preserve">, onglet </w:t>
+      </w:r>
+      <w:r>
+        <w:rPr>
+          <w:rFonts w:ascii="Consolas" w:cs="Consolas" w:eastAsia="Consolas" w:hAnsi="Consolas"/>
+          <w:color w:val="0D5C63"/>
+          <w:sz w:val="16"/>
+          <w:szCs w:val="16"/>
+          <w:shd w:fill="EDF2F1" w:color="auto" w:val="clear"/>
+        </w:rPr>
+        <w:t xml:space="preserve">Évènement</w:t>
+      </w:r>
+      <w:r>
+        <w:rPr>
+          <w:rFonts w:ascii="Cambria" w:cs="Cambria" w:eastAsia="Cambria" w:hAnsi="Cambria"/>
+          <w:color w:val="17232A"/>
+          <w:sz w:val="18"/>
+          <w:szCs w:val="18"/>
+        </w:rPr>
+        <w:t xml:space="preserve">. Cette liste ne contient que les évènements survenus depuis le démarrage du logiciel ; sinon passer par </w:t>
+      </w:r>
+      <w:r>
+        <w:rPr>
+          <w:rFonts w:ascii="Consolas" w:cs="Consolas" w:eastAsia="Consolas" w:hAnsi="Consolas"/>
+          <w:color w:val="0D5C63"/>
+          <w:sz w:val="16"/>
+          <w:szCs w:val="16"/>
+          <w:shd w:fill="EDF2F1" w:color="auto" w:val="clear"/>
+        </w:rPr>
+        <w:t xml:space="preserve">Évènements › Voir la liste</w:t>
+      </w:r>
+      <w:r>
+        <w:rPr>
+          <w:rFonts w:ascii="Cambria" w:cs="Cambria" w:eastAsia="Cambria" w:hAnsi="Cambria"/>
+          <w:color w:val="17232A"/>
+          <w:sz w:val="18"/>
+          <w:szCs w:val="18"/>
+        </w:rPr>
+        <w:t xml:space="preserve">, qui donne les 2 000 derniers.</w:t>
       </w:r>
     </w:p>
     <w:p>
@@ -1083,7 +1179,7 @@
           <w:sz w:val="18"/>
           <w:szCs w:val="18"/>
         </w:rPr>
-        <w:t xml:space="preserve">Double-cliquer sur le groupe correspondant à la personne et à son statut pour l'attribuer.</w:t>
+        <w:t xml:space="preserve">Double-cliquer sur le groupe correspondant à la personne et à son statut pour l'attribuer. Un utilisateur peut cumuler jusqu'à dix groupes d'accès.</w:t>
       </w:r>
     </w:p>
     <w:p>
@@ -1362,7 +1458,47 @@
           <w:sz w:val="18"/>
           <w:szCs w:val="18"/>
         </w:rPr>
-        <w:t xml:space="preserve">. Confirmer la suppression de la fiche ainsi que le détachement des identifiants associés.</w:t>
+        <w:t xml:space="preserve">. Confirmer la suppression, puis répondre à la seconde question : VISOR demande si les identifiants rattachés doivent être supprimés eux aussi. Répondre </w:t>
+      </w:r>
+      <w:r>
+        <w:rPr>
+          <w:rFonts w:ascii="Cambria" w:cs="Cambria" w:eastAsia="Cambria" w:hAnsi="Cambria"/>
+          <w:b/>
+          <w:bCs/>
+          <w:color w:val="17232A"/>
+          <w:sz w:val="18"/>
+          <w:szCs w:val="18"/>
+        </w:rPr>
+        <w:t xml:space="preserve">oui</w:t>
+      </w:r>
+      <w:r>
+        <w:rPr>
+          <w:rFonts w:ascii="Cambria" w:cs="Cambria" w:eastAsia="Cambria" w:hAnsi="Cambria"/>
+          <w:color w:val="17232A"/>
+          <w:sz w:val="18"/>
+          <w:szCs w:val="18"/>
+        </w:rPr>
+        <w:t xml:space="preserve"> pour un départ définitif, </w:t>
+      </w:r>
+      <w:r>
+        <w:rPr>
+          <w:rFonts w:ascii="Cambria" w:cs="Cambria" w:eastAsia="Cambria" w:hAnsi="Cambria"/>
+          <w:b/>
+          <w:bCs/>
+          <w:color w:val="17232A"/>
+          <w:sz w:val="18"/>
+          <w:szCs w:val="18"/>
+        </w:rPr>
+        <w:t xml:space="preserve">non</w:t>
+      </w:r>
+      <w:r>
+        <w:rPr>
+          <w:rFonts w:ascii="Cambria" w:cs="Cambria" w:eastAsia="Cambria" w:hAnsi="Cambria"/>
+          <w:color w:val="17232A"/>
+          <w:sz w:val="18"/>
+          <w:szCs w:val="18"/>
+        </w:rPr>
+        <w:t xml:space="preserve"> pour réattribuer le badge à quelqu'un d'autre.</w:t>
       </w:r>
     </w:p>
     <w:p>

</xml_diff>

<commit_message>
docs: fiche des contacts utiles (FIC-SG-001) et correction du nom BOURDON
Rassemble les contacts dispersés dans le cahier de consignes et dans les
procédures : urgences, interlocuteurs du site, services internes Audika,
prestataires et fournisseurs, encadrement Pénélope.

Deux constats tirés de la source :
- la table des numéros d'urgence du cahier est vide, hors centre
  antipoison ; la fiche porte les numéros nationaux et le signale
- le directeur des services généraux est Sébastien BOURDON
  (snrb@audika.com) et non « Bourbon » : PRO-SG-003 est corrigée

Pagination vérifiée au rendu : 2 pages.

Co-Authored-By: Claude Opus 5 <noreply@anthropic.com>
Claude-Session: https://claude.ai/code/session_015f3bXvDt4ZWz22riASrzWJ
</commit_message>
<xml_diff>
--- a/procedure-lyreco/PRO-SG-003_Gestion_des_acces_au_siege.docx
+++ b/procedure-lyreco/PRO-SG-003_Gestion_des_acces_au_siege.docx
@@ -187,16 +187,16 @@
           <w:sz w:val="18"/>
           <w:szCs w:val="18"/>
         </w:rPr>
-        <w:t xml:space="preserve">Sébastien Bourbon</w:t>
-      </w:r>
-      <w:r>
-        <w:rPr>
-          <w:rFonts w:ascii="Cambria" w:cs="Cambria" w:eastAsia="Cambria" w:hAnsi="Cambria"/>
-          <w:color w:val="17232A"/>
-          <w:sz w:val="18"/>
-          <w:szCs w:val="18"/>
-        </w:rPr>
-        <w:t xml:space="preserve">, responsable des services généraux — </w:t>
+        <w:t xml:space="preserve">Sébastien BOURDON</w:t>
+      </w:r>
+      <w:r>
+        <w:rPr>
+          <w:rFonts w:ascii="Cambria" w:cs="Cambria" w:eastAsia="Cambria" w:hAnsi="Cambria"/>
+          <w:color w:val="17232A"/>
+          <w:sz w:val="18"/>
+          <w:szCs w:val="18"/>
+        </w:rPr>
+        <w:t xml:space="preserve">, directeur des services généraux — snrb@audika.com, </w:t>
       </w:r>
       <w:r>
         <w:rPr>

</xml_diff>